<commit_message>
Move closing slides before Appendix and remove README references
Keep wrap-up, Thank you, and cleanup before optional content. Remove README text and hyperlinks from the decks and update facilitator guidance.

Co-authored-by: Copilot <223556219+Copilot@users.noreply.github.com>
</commit_message>
<xml_diff>
--- a/instructor/facilitator-guide.docx
+++ b/instructor/facilitator-guide.docx
@@ -6619,7 +6619,7 @@
         <w:t xml:space="preserve"> </w:t>
       </w:r>
       <w:r>
-        <w:t xml:space="preserve">divider to introduce the optional slides after Exercise 8. Cover them only</w:t>
+        <w:t xml:space="preserve">divider to introduce the optional slides after the closing and cleanup slides. Cover them only</w:t>
       </w:r>
       <w:r>
         <w:t xml:space="preserve"> </w:t>
@@ -7322,7 +7322,7 @@
         </w:numPr>
       </w:pPr>
       <w:r>
-        <w:t xml:space="preserve">End on the deck's last slide,</w:t>
+        <w:t xml:space="preserve">End the required session on</w:t>
       </w:r>
       <w:r>
         <w:t xml:space="preserve"> </w:t>
@@ -7335,7 +7335,7 @@
         <w:t xml:space="preserve">Clean up the training data</w:t>
       </w:r>
       <w:r>
-        <w:t xml:space="preserve">, and leave it up while people pack</w:t>
+        <w:t xml:space="preserve">, before the Appendix, and leave it up while people pack</w:t>
       </w:r>
       <w:r>
         <w:t xml:space="preserve"> </w:t>

</xml_diff>

<commit_message>
Move facilitation and troubleshooting into Appendix
Keep the required close together before optional Appendix content and document the troubleshooting reference for facilitators.

Co-authored-by: Copilot <223556219+Copilot@users.noreply.github.com>
</commit_message>
<xml_diff>
--- a/instructor/facilitator-guide.docx
+++ b/instructor/facilitator-guide.docx
@@ -28,7 +28,7 @@
         </w:p>
       </w:sdtContent>
     </w:sdt>
-    <w:bookmarkStart w:id="56" w:name="facilitator-guide"/>
+    <w:bookmarkStart w:id="57" w:name="facilitator-guide"/>
     <w:p>
       <w:pPr>
         <w:pStyle w:val="Heading1"/>
@@ -6589,7 +6589,7 @@
     </w:p>
     <w:bookmarkEnd w:id="38"/>
     <w:bookmarkEnd w:id="39"/>
-    <w:bookmarkStart w:id="48" w:name="appendix"/>
+    <w:bookmarkStart w:id="49" w:name="appendix"/>
     <w:p>
       <w:pPr>
         <w:pStyle w:val="Heading2"/>
@@ -6628,13 +6628,13 @@
         <w:t xml:space="preserve">if time allows, or share them after the workshop; preserve wrap-up and schedule cleanup.</w:t>
       </w:r>
     </w:p>
-    <w:bookmarkStart w:id="40" w:name="what-youll-be-able-to-do-by-the-end"/>
+    <w:bookmarkStart w:id="40" w:name="facilitation--troubleshooting"/>
     <w:p>
       <w:pPr>
         <w:pStyle w:val="Heading3"/>
       </w:pPr>
       <w:r>
-        <w:t xml:space="preserve">What you'll be able to do by the end</w:t>
+        <w:t xml:space="preserve">Facilitation &amp; troubleshooting</w:t>
       </w:r>
     </w:p>
     <w:p>
@@ -6646,19 +6646,7 @@
         </w:numPr>
       </w:pPr>
       <w:r>
-        <w:t xml:space="preserve">Use the learning-objectives slide after Exercise 8 as an optional recap of the six outcomes:</w:t>
-      </w:r>
-      <w:r>
-        <w:t xml:space="preserve"> </w:t>
-      </w:r>
-      <w:r>
-        <w:t xml:space="preserve">choose the right tool, delegate safely, ground in real content, package repeatable work,</w:t>
-      </w:r>
-      <w:r>
-        <w:t xml:space="preserve"> </w:t>
-      </w:r>
-      <w:r>
-        <w:t xml:space="preserve">build a no-code agent, and apply HR guardrails.</w:t>
+        <w:t xml:space="preserve">This instructor reference is in the Appendix after the required closing and cleanup slides.</w:t>
       </w:r>
     </w:p>
     <w:p>
@@ -6670,23 +6658,17 @@
         </w:numPr>
       </w:pPr>
       <w:r>
-        <w:t xml:space="preserve">Skip the slide if time is short; preserve wrap-up and schedule cleanup. The objectives remain</w:t>
-      </w:r>
-      <w:r>
-        <w:t xml:space="preserve"> </w:t>
-      </w:r>
-      <w:r>
-        <w:t xml:space="preserve">in the README and workbook for reference.</w:t>
+        <w:t xml:space="preserve">Use its fallback guidance for common blockers, and the readiness checklist for pre-session setup.</w:t>
       </w:r>
     </w:p>
     <w:bookmarkEnd w:id="40"/>
-    <w:bookmarkStart w:id="41" w:name="workshop-kit--download-links"/>
+    <w:bookmarkStart w:id="41" w:name="what-youll-be-able-to-do-by-the-end"/>
     <w:p>
       <w:pPr>
         <w:pStyle w:val="Heading3"/>
       </w:pPr>
       <w:r>
-        <w:t xml:space="preserve">Workshop kit / Download links</w:t>
+        <w:t xml:space="preserve">What you'll be able to do by the end</w:t>
       </w:r>
     </w:p>
     <w:p>
@@ -6698,29 +6680,47 @@
         </w:numPr>
       </w:pPr>
       <w:r>
-        <w:t xml:space="preserve">Use the kit slide after Exercise 8 for take-away downloads, or share it after the workshop.</w:t>
-      </w:r>
-      <w:r>
-        <w:t xml:space="preserve"> </w:t>
-      </w:r>
-      <w:r>
-        <w:t xml:space="preserve">Setup files must already be available through the invitation or shared Teams/SharePoint folder;</w:t>
-      </w:r>
-      <w:r>
-        <w:t xml:space="preserve"> </w:t>
-      </w:r>
-      <w:r>
-        <w:t xml:space="preserve">don't wait until this optional section to distribute the workbook and sample-data zip.</w:t>
+        <w:t xml:space="preserve">Use the learning-objectives slide after Exercise 8 as an optional recap of the six outcomes:</w:t>
+      </w:r>
+      <w:r>
+        <w:t xml:space="preserve"> </w:t>
+      </w:r>
+      <w:r>
+        <w:t xml:space="preserve">choose the right tool, delegate safely, ground in real content, package repeatable work,</w:t>
+      </w:r>
+      <w:r>
+        <w:t xml:space="preserve"> </w:t>
+      </w:r>
+      <w:r>
+        <w:t xml:space="preserve">build a no-code agent, and apply HR guardrails.</w:t>
+      </w:r>
+    </w:p>
+    <w:p>
+      <w:pPr>
+        <w:pStyle w:val="Compact"/>
+        <w:numPr>
+          <w:ilvl w:val="0"/>
+          <w:numId w:val="1018"/>
+        </w:numPr>
+      </w:pPr>
+      <w:r>
+        <w:t xml:space="preserve">Skip the slide if time is short; preserve wrap-up and schedule cleanup. The objectives remain</w:t>
+      </w:r>
+      <w:r>
+        <w:t xml:space="preserve"> </w:t>
+      </w:r>
+      <w:r>
+        <w:t xml:space="preserve">in the README and workbook for reference.</w:t>
       </w:r>
     </w:p>
     <w:bookmarkEnd w:id="41"/>
-    <w:bookmarkStart w:id="42" w:name="X0bf36d48216dd308d3c468d546a0f327e3a26ed"/>
+    <w:bookmarkStart w:id="42" w:name="workshop-kit--download-links"/>
     <w:p>
       <w:pPr>
         <w:pStyle w:val="Heading3"/>
       </w:pPr>
       <w:r>
-        <w:t xml:space="preserve">Cowork settings — Edge browsing &amp; Copilot Credits</w:t>
+        <w:t xml:space="preserve">Workshop kit / Download links</w:t>
       </w:r>
     </w:p>
     <w:p>
@@ -6732,26 +6732,29 @@
         </w:numPr>
       </w:pPr>
       <w:r>
-        <w:t xml:space="preserve">Use the Appendix slide and its example spending-policy screenshot as a setup reference.</w:t>
-      </w:r>
-      <w:r>
-        <w:t xml:space="preserve"> </w:t>
-      </w:r>
-      <w:r>
-        <w:t xml:space="preserve">Browser access and credit availability must be checked</w:t>
-      </w:r>
-      <w:r>
-        <w:t xml:space="preserve"> </w:t>
-      </w:r>
-      <w:r>
-        <w:rPr>
-          <w:b/>
-          <w:bCs/>
-        </w:rPr>
-        <w:t xml:space="preserve">before training</w:t>
-      </w:r>
-      <w:r>
-        <w:t xml:space="preserve">, not after Exercise 8.</w:t>
+        <w:t xml:space="preserve">Use the kit slide after Exercise 8 for take-away downloads, or share it after the workshop.</w:t>
+      </w:r>
+      <w:r>
+        <w:t xml:space="preserve"> </w:t>
+      </w:r>
+      <w:r>
+        <w:t xml:space="preserve">Setup files must already be available through the invitation or shared Teams/SharePoint folder;</w:t>
+      </w:r>
+      <w:r>
+        <w:t xml:space="preserve"> </w:t>
+      </w:r>
+      <w:r>
+        <w:t xml:space="preserve">don't wait until this optional section to distribute the workbook and sample-data zip.</w:t>
+      </w:r>
+    </w:p>
+    <w:bookmarkEnd w:id="42"/>
+    <w:bookmarkStart w:id="43" w:name="X0bf36d48216dd308d3c468d546a0f327e3a26ed"/>
+    <w:p>
+      <w:pPr>
+        <w:pStyle w:val="Heading3"/>
+      </w:pPr>
+      <w:r>
+        <w:t xml:space="preserve">Cowork settings — Edge browsing &amp; Copilot Credits</w:t>
       </w:r>
     </w:p>
     <w:p>
@@ -6759,23 +6762,30 @@
         <w:pStyle w:val="Compact"/>
         <w:numPr>
           <w:ilvl w:val="0"/>
-          <w:numId w:val="1019"/>
+          <w:numId w:val="1020"/>
         </w:numPr>
       </w:pPr>
       <w:r>
-        <w:t xml:space="preserve">Host/admin: enable usage-based billing, include attendees in an enabled policy selecting Cowork,</w:t>
-      </w:r>
-      <w:r>
-        <w:t xml:space="preserve"> </w:t>
-      </w:r>
-      <w:r>
-        <w:t xml:space="preserve">and confirm enough remaining policy budget and user/group credits for the exercises and retries.</w:t>
-      </w:r>
-      <w:r>
-        <w:t xml:space="preserve"> </w:t>
-      </w:r>
-      <w:r>
-        <w:t xml:space="preserve">Estimate and dry-run the workshop; do not treat the screenshot's unlimited spending as guidance.</w:t>
+        <w:t xml:space="preserve">Use the Appendix slide and its example spending-policy screenshot as a setup reference.</w:t>
+      </w:r>
+      <w:r>
+        <w:t xml:space="preserve"> </w:t>
+      </w:r>
+      <w:r>
+        <w:t xml:space="preserve">Browser access and credit availability must be checked</w:t>
+      </w:r>
+      <w:r>
+        <w:t xml:space="preserve"> </w:t>
+      </w:r>
+      <w:r>
+        <w:rPr>
+          <w:b/>
+          <w:bCs/>
+        </w:rPr>
+        <w:t xml:space="preserve">before training</w:t>
+      </w:r>
+      <w:r>
+        <w:t xml:space="preserve">, not after Exercise 8.</w:t>
       </w:r>
     </w:p>
     <w:p>
@@ -6783,33 +6793,23 @@
         <w:pStyle w:val="Compact"/>
         <w:numPr>
           <w:ilvl w:val="0"/>
-          <w:numId w:val="1019"/>
+          <w:numId w:val="1020"/>
         </w:numPr>
       </w:pPr>
       <w:r>
-        <w:t xml:space="preserve">Enable Cowork Browsing for attendees. Each user needs Edge 152+, a matching work-account profile,</w:t>
-      </w:r>
-      <w:r>
-        <w:t xml:space="preserve"> </w:t>
-      </w:r>
-      <w:r>
-        <w:t xml:space="preserve">and</w:t>
-      </w:r>
-      <w:r>
-        <w:t xml:space="preserve"> </w:t>
-      </w:r>
-      <w:r>
-        <w:rPr>
-          <w:b/>
-          <w:bCs/>
-        </w:rPr>
-        <w:t xml:space="preserve">Allow Cowork to take actions on your behalf</w:t>
-      </w:r>
-      <w:r>
-        <w:t xml:space="preserve"> </w:t>
-      </w:r>
-      <w:r>
-        <w:t xml:space="preserve">enabled in Edge Settings.</w:t>
+        <w:t xml:space="preserve">Host/admin: enable usage-based billing, include attendees in an enabled policy selecting Cowork,</w:t>
+      </w:r>
+      <w:r>
+        <w:t xml:space="preserve"> </w:t>
+      </w:r>
+      <w:r>
+        <w:t xml:space="preserve">and confirm enough remaining policy budget and user/group credits for the exercises and retries.</w:t>
+      </w:r>
+      <w:r>
+        <w:t xml:space="preserve"> </w:t>
+      </w:r>
+      <w:r>
+        <w:t xml:space="preserve">Estimate and dry-run the workshop; do not treat the screenshot's unlimited spending as guidance.</w:t>
       </w:r>
     </w:p>
     <w:p>
@@ -6817,7 +6817,41 @@
         <w:pStyle w:val="Compact"/>
         <w:numPr>
           <w:ilvl w:val="0"/>
-          <w:numId w:val="1019"/>
+          <w:numId w:val="1020"/>
+        </w:numPr>
+      </w:pPr>
+      <w:r>
+        <w:t xml:space="preserve">Enable Cowork Browsing for attendees. Each user needs Edge 152+, a matching work-account profile,</w:t>
+      </w:r>
+      <w:r>
+        <w:t xml:space="preserve"> </w:t>
+      </w:r>
+      <w:r>
+        <w:t xml:space="preserve">and</w:t>
+      </w:r>
+      <w:r>
+        <w:t xml:space="preserve"> </w:t>
+      </w:r>
+      <w:r>
+        <w:rPr>
+          <w:b/>
+          <w:bCs/>
+        </w:rPr>
+        <w:t xml:space="preserve">Allow Cowork to take actions on your behalf</w:t>
+      </w:r>
+      <w:r>
+        <w:t xml:space="preserve"> </w:t>
+      </w:r>
+      <w:r>
+        <w:t xml:space="preserve">enabled in Edge Settings.</w:t>
+      </w:r>
+    </w:p>
+    <w:p>
+      <w:pPr>
+        <w:pStyle w:val="Compact"/>
+        <w:numPr>
+          <w:ilvl w:val="0"/>
+          <w:numId w:val="1020"/>
         </w:numPr>
       </w:pPr>
       <w:r>
@@ -6855,8 +6889,8 @@
         <w:t xml:space="preserve">.</w:t>
       </w:r>
     </w:p>
-    <w:bookmarkEnd w:id="42"/>
-    <w:bookmarkStart w:id="44" w:name="X114086bd416c0b940fb68493f2e3dd92e77e083"/>
+    <w:bookmarkEnd w:id="43"/>
+    <w:bookmarkStart w:id="45" w:name="X114086bd416c0b940fb68493f2e3dd92e77e083"/>
     <w:p>
       <w:pPr>
         <w:pStyle w:val="Heading3"/>
@@ -6870,7 +6904,7 @@
         <w:pStyle w:val="Compact"/>
         <w:numPr>
           <w:ilvl w:val="0"/>
-          <w:numId w:val="1020"/>
+          <w:numId w:val="1021"/>
         </w:numPr>
       </w:pPr>
       <w:r>
@@ -6895,7 +6929,7 @@
       <w:r>
         <w:t xml:space="preserve"> </w:t>
       </w:r>
-      <w:hyperlink r:id="rId43">
+      <w:hyperlink r:id="rId44">
         <w:r>
           <w:rPr>
             <w:rStyle w:val="Hyperlink"/>
@@ -6912,7 +6946,7 @@
         <w:pStyle w:val="Compact"/>
         <w:numPr>
           <w:ilvl w:val="0"/>
-          <w:numId w:val="1020"/>
+          <w:numId w:val="1021"/>
         </w:numPr>
       </w:pPr>
       <w:r>
@@ -6991,34 +7025,6 @@
       </w:r>
       <w:r>
         <w:t xml:space="preserve">section.</w:t>
-      </w:r>
-    </w:p>
-    <w:p>
-      <w:pPr>
-        <w:pStyle w:val="Compact"/>
-        <w:numPr>
-          <w:ilvl w:val="0"/>
-          <w:numId w:val="1020"/>
-        </w:numPr>
-      </w:pPr>
-      <w:r>
-        <w:t xml:space="preserve">This detailed walkthrough is outside the required agenda. Keep brief safety reminders during</w:t>
-      </w:r>
-      <w:r>
-        <w:t xml:space="preserve"> </w:t>
-      </w:r>
-      <w:r>
-        <w:t xml:space="preserve">exercises, and skip the optional walkthrough if needed to preserve wrap-up and cleanup.</w:t>
-      </w:r>
-    </w:p>
-    <w:bookmarkEnd w:id="44"/>
-    <w:bookmarkStart w:id="45" w:name="Xd96db79b637b6f00313f6b4772441423be0dd5e"/>
-    <w:p>
-      <w:pPr>
-        <w:pStyle w:val="Heading3"/>
-      </w:pPr>
-      <w:r>
-        <w:t xml:space="preserve">Customize instructions for Cowork (after Exercise 8, if time allows)</w:t>
       </w:r>
     </w:p>
     <w:p>
@@ -7030,13 +7036,23 @@
         </w:numPr>
       </w:pPr>
       <w:r>
-        <w:t xml:space="preserve">This is optional, outside the required 155-minute agenda. Skip it when time is short; preserve</w:t>
-      </w:r>
-      <w:r>
-        <w:t xml:space="preserve"> </w:t>
-      </w:r>
-      <w:r>
-        <w:t xml:space="preserve">the wrap-up and schedule cleanup.</w:t>
+        <w:t xml:space="preserve">This detailed walkthrough is outside the required agenda. Keep brief safety reminders during</w:t>
+      </w:r>
+      <w:r>
+        <w:t xml:space="preserve"> </w:t>
+      </w:r>
+      <w:r>
+        <w:t xml:space="preserve">exercises, and skip the optional walkthrough if needed to preserve wrap-up and cleanup.</w:t>
+      </w:r>
+    </w:p>
+    <w:bookmarkEnd w:id="45"/>
+    <w:bookmarkStart w:id="46" w:name="Xd96db79b637b6f00313f6b4772441423be0dd5e"/>
+    <w:p>
+      <w:pPr>
+        <w:pStyle w:val="Heading3"/>
+      </w:pPr>
+      <w:r>
+        <w:t xml:space="preserve">Customize instructions for Cowork (after Exercise 8, if time allows)</w:t>
       </w:r>
     </w:p>
     <w:p>
@@ -7044,10 +7060,28 @@
         <w:pStyle w:val="Compact"/>
         <w:numPr>
           <w:ilvl w:val="0"/>
-          <w:numId w:val="1021"/>
+          <w:numId w:val="1022"/>
         </w:numPr>
       </w:pPr>
       <w:r>
+        <w:t xml:space="preserve">This is optional, outside the required 155-minute agenda. Skip it when time is short; preserve</w:t>
+      </w:r>
+      <w:r>
+        <w:t xml:space="preserve"> </w:t>
+      </w:r>
+      <w:r>
+        <w:t xml:space="preserve">the wrap-up and schedule cleanup.</w:t>
+      </w:r>
+    </w:p>
+    <w:p>
+      <w:pPr>
+        <w:pStyle w:val="Compact"/>
+        <w:numPr>
+          <w:ilvl w:val="0"/>
+          <w:numId w:val="1022"/>
+        </w:numPr>
+      </w:pPr>
+      <w:r>
         <w:t xml:space="preserve">Use the deck's</w:t>
       </w:r>
       <w:r>
@@ -7069,7 +7103,7 @@
       <w:r>
         <w:t xml:space="preserve"> </w:t>
       </w:r>
-      <w:hyperlink r:id="rId43">
+      <w:hyperlink r:id="rId44">
         <w:r>
           <w:rPr>
             <w:rStyle w:val="Hyperlink"/>
@@ -7086,7 +7120,7 @@
         <w:pStyle w:val="Compact"/>
         <w:numPr>
           <w:ilvl w:val="0"/>
-          <w:numId w:val="1021"/>
+          <w:numId w:val="1022"/>
         </w:numPr>
       </w:pPr>
       <w:r>
@@ -7123,34 +7157,6 @@
       </w:r>
       <w:r>
         <w:t xml:space="preserve">. It applies to future tasks, not earlier ones.</w:t>
-      </w:r>
-    </w:p>
-    <w:p>
-      <w:pPr>
-        <w:pStyle w:val="Compact"/>
-        <w:numPr>
-          <w:ilvl w:val="0"/>
-          <w:numId w:val="1021"/>
-        </w:numPr>
-      </w:pPr>
-      <w:r>
-        <w:t xml:space="preserve">Keep preferences short and personal. Choose one role sample, rather than stacking all of them.</w:t>
-      </w:r>
-      <w:r>
-        <w:t xml:space="preserve"> </w:t>
-      </w:r>
-      <w:r>
-        <w:t xml:space="preserve">Clear or adapt the Zava instructions before returning to real work.</w:t>
-      </w:r>
-    </w:p>
-    <w:bookmarkEnd w:id="45"/>
-    <w:bookmarkStart w:id="47" w:name="X4d50050e2fcb0cfc72f8fb4ca04685ffd234a1f"/>
-    <w:p>
-      <w:pPr>
-        <w:pStyle w:val="Heading3"/>
-      </w:pPr>
-      <w:r>
-        <w:t xml:space="preserve">Responsible use — the golden rules (optional recap after Exercise 8)</w:t>
       </w:r>
     </w:p>
     <w:p>
@@ -7162,32 +7168,23 @@
         </w:numPr>
       </w:pPr>
       <w:r>
-        <w:t xml:space="preserve">The detailed slide is in the</w:t>
-      </w:r>
-      <w:r>
-        <w:t xml:space="preserve"> </w:t>
-      </w:r>
-      <w:r>
-        <w:rPr>
-          <w:b/>
-          <w:bCs/>
-        </w:rPr>
-        <w:t xml:space="preserve">Appendix</w:t>
-      </w:r>
-      <w:r>
-        <w:t xml:space="preserve">. Use it if time allows, or share it after the workshop.</w:t>
-      </w:r>
-      <w:r>
-        <w:t xml:space="preserve"> </w:t>
-      </w:r>
-      <w:r>
-        <w:t xml:space="preserve">The rules themselves still apply to every exercise: draft, review, approve one action at a time,</w:t>
-      </w:r>
-      <w:r>
-        <w:t xml:space="preserve"> </w:t>
-      </w:r>
-      <w:r>
-        <w:t xml:space="preserve">keep real data private, and cite and confirm policy answers.</w:t>
+        <w:t xml:space="preserve">Keep preferences short and personal. Choose one role sample, rather than stacking all of them.</w:t>
+      </w:r>
+      <w:r>
+        <w:t xml:space="preserve"> </w:t>
+      </w:r>
+      <w:r>
+        <w:t xml:space="preserve">Clear or adapt the Zava instructions before returning to real work.</w:t>
+      </w:r>
+    </w:p>
+    <w:bookmarkEnd w:id="46"/>
+    <w:bookmarkStart w:id="48" w:name="X4d50050e2fcb0cfc72f8fb4ca04685ffd234a1f"/>
+    <w:p>
+      <w:pPr>
+        <w:pStyle w:val="Heading3"/>
+      </w:pPr>
+      <w:r>
+        <w:t xml:space="preserve">Responsible use — the golden rules (optional recap after Exercise 8)</w:t>
       </w:r>
     </w:p>
     <w:p>
@@ -7195,16 +7192,53 @@
         <w:pStyle w:val="Compact"/>
         <w:numPr>
           <w:ilvl w:val="0"/>
-          <w:numId w:val="1022"/>
+          <w:numId w:val="1023"/>
         </w:numPr>
       </w:pPr>
       <w:r>
+        <w:t xml:space="preserve">The detailed slide is in the</w:t>
+      </w:r>
+      <w:r>
+        <w:t xml:space="preserve"> </w:t>
+      </w:r>
+      <w:r>
+        <w:rPr>
+          <w:b/>
+          <w:bCs/>
+        </w:rPr>
+        <w:t xml:space="preserve">Appendix</w:t>
+      </w:r>
+      <w:r>
+        <w:t xml:space="preserve">. Use it if time allows, or share it after the workshop.</w:t>
+      </w:r>
+      <w:r>
+        <w:t xml:space="preserve"> </w:t>
+      </w:r>
+      <w:r>
+        <w:t xml:space="preserve">The rules themselves still apply to every exercise: draft, review, approve one action at a time,</w:t>
+      </w:r>
+      <w:r>
+        <w:t xml:space="preserve"> </w:t>
+      </w:r>
+      <w:r>
+        <w:t xml:space="preserve">keep real data private, and cite and confirm policy answers.</w:t>
+      </w:r>
+    </w:p>
+    <w:p>
+      <w:pPr>
+        <w:pStyle w:val="Compact"/>
+        <w:numPr>
+          <w:ilvl w:val="0"/>
+          <w:numId w:val="1023"/>
+        </w:numPr>
+      </w:pPr>
+      <w:r>
         <w:t xml:space="preserve">See</w:t>
       </w:r>
       <w:r>
         <w:t xml:space="preserve"> </w:t>
       </w:r>
-      <w:hyperlink r:id="rId46">
+      <w:hyperlink r:id="rId47">
         <w:r>
           <w:rPr>
             <w:rStyle w:val="Hyperlink"/>
@@ -7216,9 +7250,9 @@
         <w:t xml:space="preserve">.</w:t>
       </w:r>
     </w:p>
-    <w:bookmarkEnd w:id="47"/>
     <w:bookmarkEnd w:id="48"/>
-    <w:bookmarkStart w:id="51" w:name="closing"/>
+    <w:bookmarkEnd w:id="49"/>
+    <w:bookmarkStart w:id="52" w:name="closing"/>
     <w:p>
       <w:pPr>
         <w:pStyle w:val="Heading2"/>
@@ -7227,7 +7261,7 @@
         <w:t xml:space="preserve">Closing</w:t>
       </w:r>
     </w:p>
-    <w:bookmarkStart w:id="50" w:name="wrap-up-230235"/>
+    <w:bookmarkStart w:id="51" w:name="wrap-up-230235"/>
     <w:p>
       <w:pPr>
         <w:pStyle w:val="Heading3"/>
@@ -7241,7 +7275,7 @@
         <w:pStyle w:val="Compact"/>
         <w:numPr>
           <w:ilvl w:val="0"/>
-          <w:numId w:val="1023"/>
+          <w:numId w:val="1024"/>
         </w:numPr>
       </w:pPr>
       <w:r>
@@ -7253,7 +7287,7 @@
         <w:pStyle w:val="Compact"/>
         <w:numPr>
           <w:ilvl w:val="0"/>
-          <w:numId w:val="1023"/>
+          <w:numId w:val="1024"/>
         </w:numPr>
       </w:pPr>
       <w:r>
@@ -7284,7 +7318,7 @@
         <w:pStyle w:val="Compact"/>
         <w:numPr>
           <w:ilvl w:val="0"/>
-          <w:numId w:val="1023"/>
+          <w:numId w:val="1024"/>
         </w:numPr>
       </w:pPr>
       <w:r>
@@ -7318,7 +7352,7 @@
         <w:pStyle w:val="Compact"/>
         <w:numPr>
           <w:ilvl w:val="0"/>
-          <w:numId w:val="1023"/>
+          <w:numId w:val="1024"/>
         </w:numPr>
       </w:pPr>
       <w:r>
@@ -7346,7 +7380,7 @@
       <w:r>
         <w:t xml:space="preserve"> </w:t>
       </w:r>
-      <w:hyperlink r:id="rId43">
+      <w:hyperlink r:id="rId44">
         <w:r>
           <w:rPr>
             <w:rStyle w:val="Hyperlink"/>
@@ -7378,7 +7412,7 @@
         <w:pStyle w:val="Compact"/>
         <w:numPr>
           <w:ilvl w:val="0"/>
-          <w:numId w:val="1023"/>
+          <w:numId w:val="1024"/>
         </w:numPr>
       </w:pPr>
       <w:r>
@@ -7387,7 +7421,7 @@
       <w:r>
         <w:t xml:space="preserve"> </w:t>
       </w:r>
-      <w:hyperlink r:id="rId46">
+      <w:hyperlink r:id="rId47">
         <w:r>
           <w:rPr>
             <w:rStyle w:val="Hyperlink"/>
@@ -7404,7 +7438,7 @@
         <w:pStyle w:val="Compact"/>
         <w:numPr>
           <w:ilvl w:val="0"/>
-          <w:numId w:val="1023"/>
+          <w:numId w:val="1024"/>
         </w:numPr>
       </w:pPr>
       <w:r>
@@ -7413,7 +7447,7 @@
       <w:r>
         <w:t xml:space="preserve"> </w:t>
       </w:r>
-      <w:hyperlink r:id="rId49">
+      <w:hyperlink r:id="rId50">
         <w:r>
           <w:rPr>
             <w:rStyle w:val="Hyperlink"/>
@@ -7433,7 +7467,7 @@
         <w:pStyle w:val="Compact"/>
         <w:numPr>
           <w:ilvl w:val="0"/>
-          <w:numId w:val="1023"/>
+          <w:numId w:val="1024"/>
         </w:numPr>
       </w:pPr>
       <w:r>
@@ -7445,7 +7479,7 @@
         <w:pStyle w:val="Compact"/>
         <w:numPr>
           <w:ilvl w:val="0"/>
-          <w:numId w:val="1023"/>
+          <w:numId w:val="1024"/>
         </w:numPr>
       </w:pPr>
       <w:r>
@@ -7457,7 +7491,7 @@
         <w:pStyle w:val="Compact"/>
         <w:numPr>
           <w:ilvl w:val="0"/>
-          <w:numId w:val="1023"/>
+          <w:numId w:val="1024"/>
         </w:numPr>
       </w:pPr>
       <w:r>
@@ -7497,9 +7531,9 @@
         <w:t xml:space="preserve">survey, and 30-day adoption plan).</w:t>
       </w:r>
     </w:p>
-    <w:bookmarkEnd w:id="50"/>
     <w:bookmarkEnd w:id="51"/>
-    <w:bookmarkStart w:id="52" w:name="troubleshooting-triage-hand-to-proctors"/>
+    <w:bookmarkEnd w:id="52"/>
+    <w:bookmarkStart w:id="53" w:name="troubleshooting-triage-hand-to-proctors"/>
     <w:p>
       <w:pPr>
         <w:pStyle w:val="Heading2"/>
@@ -8891,7 +8925,7 @@
               </w:rPr>
               <w:t xml:space="preserve"> </w:t>
             </w:r>
-            <w:hyperlink r:id="rId43">
+            <w:hyperlink r:id="rId44">
               <w:r>
                 <w:rPr>
                   <w:rStyle w:val="Hyperlink"/>
@@ -8990,8 +9024,8 @@
         </w:tc>
       </w:tr>
     </w:tbl>
-    <w:bookmarkEnd w:id="52"/>
-    <w:bookmarkStart w:id="53" w:name="time-checks-and-what-to-cut"/>
+    <w:bookmarkEnd w:id="53"/>
+    <w:bookmarkStart w:id="54" w:name="time-checks-and-what-to-cut"/>
     <w:p>
       <w:pPr>
         <w:pStyle w:val="Heading2"/>
@@ -9578,7 +9612,7 @@
       <w:r>
         <w:t xml:space="preserve"> </w:t>
       </w:r>
-      <w:hyperlink r:id="rId43">
+      <w:hyperlink r:id="rId44">
         <w:r>
           <w:rPr>
             <w:rStyle w:val="Hyperlink"/>
@@ -9592,7 +9626,7 @@
       <w:r>
         <w:t xml:space="preserve"> </w:t>
       </w:r>
-      <w:hyperlink r:id="rId49">
+      <w:hyperlink r:id="rId50">
         <w:r>
           <w:rPr>
             <w:rStyle w:val="Hyperlink"/>
@@ -9604,8 +9638,8 @@
         <w:t xml:space="preserve">.</w:t>
       </w:r>
     </w:p>
-    <w:bookmarkEnd w:id="53"/>
-    <w:bookmarkStart w:id="54" w:name="pacing-tips-for-25-people"/>
+    <w:bookmarkEnd w:id="54"/>
+    <w:bookmarkStart w:id="55" w:name="pacing-tips-for-25-people"/>
     <w:p>
       <w:pPr>
         <w:pStyle w:val="Heading2"/>
@@ -9619,7 +9653,7 @@
         <w:pStyle w:val="Compact"/>
         <w:numPr>
           <w:ilvl w:val="0"/>
-          <w:numId w:val="1024"/>
+          <w:numId w:val="1025"/>
         </w:numPr>
       </w:pPr>
       <w:r>
@@ -9653,7 +9687,7 @@
         <w:pStyle w:val="Compact"/>
         <w:numPr>
           <w:ilvl w:val="0"/>
-          <w:numId w:val="1024"/>
+          <w:numId w:val="1025"/>
         </w:numPr>
       </w:pPr>
       <w:r>
@@ -9678,7 +9712,7 @@
       <w:r>
         <w:t xml:space="preserve"> </w:t>
       </w:r>
-      <w:hyperlink r:id="rId43">
+      <w:hyperlink r:id="rId44">
         <w:r>
           <w:rPr>
             <w:rStyle w:val="Hyperlink"/>
@@ -9701,7 +9735,7 @@
         <w:pStyle w:val="Compact"/>
         <w:numPr>
           <w:ilvl w:val="0"/>
-          <w:numId w:val="1024"/>
+          <w:numId w:val="1025"/>
         </w:numPr>
       </w:pPr>
       <w:r>
@@ -9722,58 +9756,6 @@
       </w:r>
       <w:r>
         <w:t xml:space="preserve">it and keep moving; a proctor follows up.</w:t>
-      </w:r>
-    </w:p>
-    <w:p>
-      <w:pPr>
-        <w:pStyle w:val="Compact"/>
-        <w:numPr>
-          <w:ilvl w:val="0"/>
-          <w:numId w:val="1024"/>
-        </w:numPr>
-      </w:pPr>
-      <w:r>
-        <w:t xml:space="preserve">Timings are guidance; if you're running long, keep everyone on the required tasks (the optional</w:t>
-      </w:r>
-      <w:r>
-        <w:t xml:space="preserve"> </w:t>
-      </w:r>
-      <w:r>
-        <w:t xml:space="preserve">1c, 2b, 5b, 5c, and 6c are for fast finishers) and/or run Ex 7 as a</w:t>
-      </w:r>
-      <w:r>
-        <w:t xml:space="preserve"> </w:t>
-      </w:r>
-      <w:r>
-        <w:rPr>
-          <w:b/>
-          <w:bCs/>
-        </w:rPr>
-        <w:t xml:space="preserve">facilitator demo</w:t>
-      </w:r>
-      <w:r>
-        <w:t xml:space="preserve"> </w:t>
-      </w:r>
-      <w:r>
-        <w:t xml:space="preserve">(attendees watch, then build after) — protect Ex 3 and the Ex 7 concept.</w:t>
-      </w:r>
-    </w:p>
-    <w:bookmarkEnd w:id="54"/>
-    <w:bookmarkStart w:id="55" w:name="success-criteria"/>
-    <w:p>
-      <w:pPr>
-        <w:pStyle w:val="Heading2"/>
-      </w:pPr>
-      <w:r>
-        <w:t xml:space="preserve">Success criteria</w:t>
-      </w:r>
-    </w:p>
-    <w:p>
-      <w:pPr>
-        <w:pStyle w:val="FirstParagraph"/>
-      </w:pPr>
-      <w:r>
-        <w:t xml:space="preserve">By the end, each ready attendee has:</w:t>
       </w:r>
     </w:p>
     <w:p>
@@ -9785,23 +9767,47 @@
         </w:numPr>
       </w:pPr>
       <w:r>
-        <w:t xml:space="preserve">Understood when to use</w:t>
-      </w:r>
-      <w:r>
-        <w:t xml:space="preserve"> </w:t>
-      </w:r>
-      <w:r>
-        <w:rPr>
-          <w:b/>
-          <w:bCs/>
-        </w:rPr>
-        <w:t xml:space="preserve">Copilot Chat vs. Cowork</w:t>
-      </w:r>
-      <w:r>
-        <w:t xml:space="preserve"> </w:t>
-      </w:r>
-      <w:r>
-        <w:t xml:space="preserve">(opening segment)</w:t>
+        <w:t xml:space="preserve">Timings are guidance; if you're running long, keep everyone on the required tasks (the optional</w:t>
+      </w:r>
+      <w:r>
+        <w:t xml:space="preserve"> </w:t>
+      </w:r>
+      <w:r>
+        <w:t xml:space="preserve">1c, 2b, 5b, 5c, and 6c are for fast finishers) and/or run Ex 7 as a</w:t>
+      </w:r>
+      <w:r>
+        <w:t xml:space="preserve"> </w:t>
+      </w:r>
+      <w:r>
+        <w:rPr>
+          <w:b/>
+          <w:bCs/>
+        </w:rPr>
+        <w:t xml:space="preserve">facilitator demo</w:t>
+      </w:r>
+      <w:r>
+        <w:t xml:space="preserve"> </w:t>
+      </w:r>
+      <w:r>
+        <w:t xml:space="preserve">(attendees watch, then build after) — protect Ex 3 and the Ex 7 concept.</w:t>
+      </w:r>
+    </w:p>
+    <w:bookmarkEnd w:id="55"/>
+    <w:bookmarkStart w:id="56" w:name="success-criteria"/>
+    <w:p>
+      <w:pPr>
+        <w:pStyle w:val="Heading2"/>
+      </w:pPr>
+      <w:r>
+        <w:t xml:space="preserve">Success criteria</w:t>
+      </w:r>
+    </w:p>
+    <w:p>
+      <w:pPr>
+        <w:pStyle w:val="FirstParagraph"/>
+      </w:pPr>
+      <w:r>
+        <w:t xml:space="preserve">By the end, each ready attendee has:</w:t>
       </w:r>
     </w:p>
     <w:p>
@@ -9813,23 +9819,23 @@
         </w:numPr>
       </w:pPr>
       <w:r>
-        <w:t xml:space="preserve">Toured the Cowork UI —</w:t>
-      </w:r>
-      <w:r>
-        <w:t xml:space="preserve"> </w:t>
-      </w:r>
-      <w:r>
-        <w:rPr>
-          <w:b/>
-          <w:bCs/>
-        </w:rPr>
-        <w:t xml:space="preserve">New task, My tasks, Automations, Customize</w:t>
-      </w:r>
-      <w:r>
-        <w:t xml:space="preserve"> </w:t>
-      </w:r>
-      <w:r>
-        <w:t xml:space="preserve">(walkthrough)</w:t>
+        <w:t xml:space="preserve">Understood when to use</w:t>
+      </w:r>
+      <w:r>
+        <w:t xml:space="preserve"> </w:t>
+      </w:r>
+      <w:r>
+        <w:rPr>
+          <w:b/>
+          <w:bCs/>
+        </w:rPr>
+        <w:t xml:space="preserve">Copilot Chat vs. Cowork</w:t>
+      </w:r>
+      <w:r>
+        <w:t xml:space="preserve"> </w:t>
+      </w:r>
+      <w:r>
+        <w:t xml:space="preserve">(opening segment)</w:t>
       </w:r>
     </w:p>
     <w:p>
@@ -9841,45 +9847,23 @@
         </w:numPr>
       </w:pPr>
       <w:r>
-        <w:t xml:space="preserve">Built an</w:t>
-      </w:r>
-      <w:r>
-        <w:t xml:space="preserve"> </w:t>
-      </w:r>
-      <w:r>
-        <w:rPr>
-          <w:b/>
-          <w:bCs/>
-        </w:rPr>
-        <w:t xml:space="preserve">Executive Command Center</w:t>
-      </w:r>
-      <w:r>
-        <w:t xml:space="preserve"> </w:t>
-      </w:r>
-      <w:r>
-        <w:t xml:space="preserve">HTML dashboard, found it in the</w:t>
-      </w:r>
-      <w:r>
-        <w:t xml:space="preserve"> </w:t>
-      </w:r>
-      <w:r>
-        <w:rPr>
-          <w:b/>
-          <w:bCs/>
-        </w:rPr>
-        <w:t xml:space="preserve">Output folder</w:t>
-      </w:r>
-      <w:r>
-        <w:t xml:space="preserve"> </w:t>
-      </w:r>
-      <w:r>
-        <w:t xml:space="preserve">and</w:t>
-      </w:r>
-      <w:r>
-        <w:t xml:space="preserve"> </w:t>
-      </w:r>
-      <w:r>
-        <w:t xml:space="preserve">OneDrive → Cowork, and saved it as a skill with a schedule, approving one action at a time (Ex 8)</w:t>
+        <w:t xml:space="preserve">Toured the Cowork UI —</w:t>
+      </w:r>
+      <w:r>
+        <w:t xml:space="preserve"> </w:t>
+      </w:r>
+      <w:r>
+        <w:rPr>
+          <w:b/>
+          <w:bCs/>
+        </w:rPr>
+        <w:t xml:space="preserve">New task, My tasks, Automations, Customize</w:t>
+      </w:r>
+      <w:r>
+        <w:t xml:space="preserve"> </w:t>
+      </w:r>
+      <w:r>
+        <w:t xml:space="preserve">(walkthrough)</w:t>
       </w:r>
     </w:p>
     <w:p>
@@ -9891,13 +9875,45 @@
         </w:numPr>
       </w:pPr>
       <w:r>
-        <w:t xml:space="preserve">Produced a cited web-research briefing and 5 interview questions grounded in the job</w:t>
-      </w:r>
-      <w:r>
-        <w:t xml:space="preserve"> </w:t>
-      </w:r>
-      <w:r>
-        <w:t xml:space="preserve">description (Ex 1)</w:t>
+        <w:t xml:space="preserve">Built an</w:t>
+      </w:r>
+      <w:r>
+        <w:t xml:space="preserve"> </w:t>
+      </w:r>
+      <w:r>
+        <w:rPr>
+          <w:b/>
+          <w:bCs/>
+        </w:rPr>
+        <w:t xml:space="preserve">Executive Command Center</w:t>
+      </w:r>
+      <w:r>
+        <w:t xml:space="preserve"> </w:t>
+      </w:r>
+      <w:r>
+        <w:t xml:space="preserve">HTML dashboard, found it in the</w:t>
+      </w:r>
+      <w:r>
+        <w:t xml:space="preserve"> </w:t>
+      </w:r>
+      <w:r>
+        <w:rPr>
+          <w:b/>
+          <w:bCs/>
+        </w:rPr>
+        <w:t xml:space="preserve">Output folder</w:t>
+      </w:r>
+      <w:r>
+        <w:t xml:space="preserve"> </w:t>
+      </w:r>
+      <w:r>
+        <w:t xml:space="preserve">and</w:t>
+      </w:r>
+      <w:r>
+        <w:t xml:space="preserve"> </w:t>
+      </w:r>
+      <w:r>
+        <w:t xml:space="preserve">OneDrive → Cowork, and saved it as a skill with a schedule, approving one action at a time (Ex 8)</w:t>
       </w:r>
     </w:p>
     <w:p>
@@ -9909,23 +9925,13 @@
         </w:numPr>
       </w:pPr>
       <w:r>
-        <w:t xml:space="preserve">Had Cowork</w:t>
-      </w:r>
-      <w:r>
-        <w:t xml:space="preserve"> </w:t>
-      </w:r>
-      <w:r>
-        <w:rPr>
-          <w:b/>
-          <w:bCs/>
-        </w:rPr>
-        <w:t xml:space="preserve">navigate two websites</w:t>
-      </w:r>
-      <w:r>
-        <w:t xml:space="preserve"> </w:t>
-      </w:r>
-      <w:r>
-        <w:t xml:space="preserve">in Edge and build a linked comparison table (Ex 2)</w:t>
+        <w:t xml:space="preserve">Produced a cited web-research briefing and 5 interview questions grounded in the job</w:t>
+      </w:r>
+      <w:r>
+        <w:t xml:space="preserve"> </w:t>
+      </w:r>
+      <w:r>
+        <w:t xml:space="preserve">description (Ex 1)</w:t>
       </w:r>
     </w:p>
     <w:p>
@@ -9937,7 +9943,23 @@
         </w:numPr>
       </w:pPr>
       <w:r>
-        <w:t xml:space="preserve">Built and tested a custom skill scoring Good+ (Ex 3)</w:t>
+        <w:t xml:space="preserve">Had Cowork</w:t>
+      </w:r>
+      <w:r>
+        <w:t xml:space="preserve"> </w:t>
+      </w:r>
+      <w:r>
+        <w:rPr>
+          <w:b/>
+          <w:bCs/>
+        </w:rPr>
+        <w:t xml:space="preserve">navigate two websites</w:t>
+      </w:r>
+      <w:r>
+        <w:t xml:space="preserve"> </w:t>
+      </w:r>
+      <w:r>
+        <w:t xml:space="preserve">in Edge and build a linked comparison table (Ex 2)</w:t>
       </w:r>
     </w:p>
     <w:p>
@@ -9949,7 +9971,7 @@
         </w:numPr>
       </w:pPr>
       <w:r>
-        <w:t xml:space="preserve">Wrote an inclusive job posting and a ticket report (Ex 4)</w:t>
+        <w:t xml:space="preserve">Built and tested a custom skill scoring Good+ (Ex 3)</w:t>
       </w:r>
     </w:p>
     <w:p>
@@ -9961,7 +9983,7 @@
         </w:numPr>
       </w:pPr>
       <w:r>
-        <w:t xml:space="preserve">Built an onboarding orientation deck from the Zava files (Ex 5)</w:t>
+        <w:t xml:space="preserve">Wrote an inclusive job posting and a ticket report (Ex 4)</w:t>
       </w:r>
     </w:p>
     <w:p>
@@ -9973,7 +9995,7 @@
         </w:numPr>
       </w:pPr>
       <w:r>
-        <w:t xml:space="preserve">Created a recurring Automation and a Daily Briefing (Ex 6)</w:t>
+        <w:t xml:space="preserve">Built an onboarding orientation deck from the Zava files (Ex 5)</w:t>
       </w:r>
     </w:p>
     <w:p>
@@ -9985,6 +10007,18 @@
         </w:numPr>
       </w:pPr>
       <w:r>
+        <w:t xml:space="preserve">Created a recurring Automation and a Daily Briefing (Ex 6)</w:t>
+      </w:r>
+    </w:p>
+    <w:p>
+      <w:pPr>
+        <w:pStyle w:val="Compact"/>
+        <w:numPr>
+          <w:ilvl w:val="0"/>
+          <w:numId w:val="1035"/>
+        </w:numPr>
+      </w:pPr>
+      <w:r>
         <w:t xml:space="preserve">Built and tested an</w:t>
       </w:r>
       <w:r>
@@ -10004,8 +10038,8 @@
         <w:t xml:space="preserve">in Copilot Agent Builder (Ex 7)</w:t>
       </w:r>
     </w:p>
-    <w:bookmarkEnd w:id="55"/>
     <w:bookmarkEnd w:id="56"/>
+    <w:bookmarkEnd w:id="57"/>
     <w:sectPr>
       <w:footerReference w:type="default" r:id="rId10"/>
       <w:footnotePr>
@@ -10515,7 +10549,7 @@
     <w:abstractNumId w:val="991"/>
   </w:num>
   <w:num w:numId="1025">
-    <w:abstractNumId w:val="992"/>
+    <w:abstractNumId w:val="991"/>
   </w:num>
   <w:num w:numId="1026">
     <w:abstractNumId w:val="992"/>
@@ -10542,6 +10576,9 @@
     <w:abstractNumId w:val="992"/>
   </w:num>
   <w:num w:numId="1034">
+    <w:abstractNumId w:val="992"/>
+  </w:num>
+  <w:num w:numId="1035">
     <w:abstractNumId w:val="992"/>
   </w:num>
 </w:numbering>

</xml_diff>